<commit_message>
Added Project Description and Questions for lecturers
</commit_message>
<xml_diff>
--- a/Project Description.docx
+++ b/Project Description.docx
@@ -111,26 +111,14 @@
           <w:rPr>
             <w:rStyle w:val="Hyperlink"/>
           </w:rPr>
-          <w:t>https://www.kaggle.com/datasets/thedevastator/global-air-transportation-netwo</w:t>
-        </w:r>
-        <w:r>
-          <w:rPr>
-            <w:rStyle w:val="Hyperlink"/>
-          </w:rPr>
-          <w:t>r</w:t>
-        </w:r>
-        <w:r>
-          <w:rPr>
-            <w:rStyle w:val="Hyperlink"/>
-          </w:rPr>
-          <w:t>k-mapping-the-wo?select=routes.csv</w:t>
+          <w:t>https://www.kaggle.com/datasets/thedevastator/global-air-transportation-network-mapping-the-wo?select=routes.csv</w:t>
         </w:r>
       </w:hyperlink>
     </w:p>
     <w:p>
       <w:r>
         <w:pict w14:anchorId="0C8F0927">
-          <v:rect id="_x0000_i1031" style="width:0;height:1.5pt" o:hralign="center" o:hrstd="t" o:hr="t" fillcolor="#a0a0a0" stroked="f"/>
+          <v:rect id="_x0000_i1025" style="width:0;height:1.5pt" o:hralign="center" o:hrstd="t" o:hr="t" fillcolor="#a0a0a0" stroked="f"/>
         </w:pict>
       </w:r>
     </w:p>
@@ -1173,6 +1161,7 @@
   <w:style w:type="character" w:default="1" w:styleId="DefaultParagraphFont">
     <w:name w:val="Default Paragraph Font"/>
     <w:uiPriority w:val="1"/>
+    <w:semiHidden/>
     <w:unhideWhenUsed/>
   </w:style>
   <w:style w:type="table" w:default="1" w:styleId="TableNormal">

</xml_diff>